<commit_message>
Weekly: match approved example structure (single title, bold-italic subheads); keep Georgia + endnotes
Per the uploaded FASCSA exemplar (parsed its XML): single Title line (no subtitle),
Analysis subheadings are bold italic, sizes Title 14 / section 12 / sub-head 11,
black headings, bulleted Takeaways. Font stays Georgia (user's choice) and notes
stay endnotes (the exemplar used footnotes; user wants endnotes). Updated
template.docx, SKILL.md, and article-template.md accordingly.
</commit_message>
<xml_diff>
--- a/skills/ai-legal-news-weekly/references/template.docx
+++ b/skills/ai-legal-news-weekly/references/template.docx
@@ -7,15 +7,7 @@
         <w:pStyle w:val="Title"/>
       </w:pPr>
       <w:r>
-        <w:t xml:space="preserve">[TITLE — short, e.g., FASCSA in the AI Era]</w:t>
-      </w:r>
-    </w:p>
-    <w:p>
-      <w:pPr>
-        <w:pStyle w:val="Subtitle"/>
-      </w:pPr>
-      <w:r>
-        <w:t xml:space="preserve">[Subtitle — the specific holding or question, e.g., The D.C. Circuit's Anthropic Stay Denial and the Merits Questions Reserved for May 19]</w:t>
+        <w:t xml:space="preserve">[TITLE — one line naming the development and the holding or question, e.g., FASCSA in the AI Era: The D.C. Circuit's Anthropic Stay Denial and the Merits Questions Reserved for May 19]</w:t>
       </w:r>
     </w:p>
     <w:p>
@@ -339,6 +331,7 @@
     </w:pPr>
     <w:rPr>
       <w:b/>
+      <w:i/>
       <w:color w:val="000000"/>
       <w:sz w:val="22"/>
       <w:szCs w:val="22"/>

</xml_diff>